<commit_message>
all updates including new material in appendix chap e and f before final proof-reading
</commit_message>
<xml_diff>
--- a/resources/pdfs/FrontisMatter.docx
+++ b/resources/pdfs/FrontisMatter.docx
@@ -139,7 +139,19 @@
         <w:rPr>
           <w:rFonts w:ascii="Libre Baskerville" w:hAnsi="Libre Baskerville"/>
         </w:rPr>
-        <w:t xml:space="preserve">A mini-treatise on the mathematics, philosophy and practice of Transformatics for </w:t>
+        <w:t xml:space="preserve">A </w:t>
+      </w:r>
+      <w:r>
+        <w:rPr>
+          <w:rFonts w:ascii="Libre Baskerville" w:hAnsi="Libre Baskerville"/>
+        </w:rPr>
+        <w:t xml:space="preserve">treatise on the mathematics, philosophy and practice of Transformatics for </w:t>
+      </w:r>
+      <w:r>
+        <w:rPr>
+          <w:rFonts w:ascii="Libre Baskerville" w:hAnsi="Libre Baskerville"/>
+        </w:rPr>
+        <w:t xml:space="preserve">modern </w:t>
       </w:r>
       <w:r>
         <w:rPr>
@@ -307,164 +319,121 @@
           <w:i/>
         </w:rPr>
       </w:pPr>
-      <w:proofErr w:type="spellStart"/>
-      <w:r>
-        <w:rPr>
-          <w:rFonts w:ascii="Libre Baskerville" w:hAnsi="Libre Baskerville"/>
-          <w:i/>
-        </w:rPr>
-        <w:t>Embaga</w:t>
-      </w:r>
-      <w:proofErr w:type="spellEnd"/>
-      <w:r>
-        <w:rPr>
-          <w:rFonts w:ascii="Libre Baskerville" w:hAnsi="Libre Baskerville"/>
-          <w:i/>
-        </w:rPr>
-        <w:t xml:space="preserve"> Ku </w:t>
-      </w:r>
-      <w:proofErr w:type="spellStart"/>
-      <w:r>
-        <w:rPr>
-          <w:rFonts w:ascii="Libre Baskerville" w:hAnsi="Libre Baskerville"/>
-          <w:i/>
-        </w:rPr>
-        <w:t>Rina</w:t>
-      </w:r>
-      <w:proofErr w:type="spellEnd"/>
-      <w:r>
-        <w:rPr>
-          <w:rFonts w:ascii="Libre Baskerville" w:hAnsi="Libre Baskerville"/>
-          <w:i/>
-        </w:rPr>
-        <w:t xml:space="preserve"> Island</w:t>
-      </w:r>
-    </w:p>
-    <w:p>
-      <w:pPr>
-        <w:jc w:val="center"/>
-        <w:rPr>
-          <w:rFonts w:ascii="Libre Baskerville" w:hAnsi="Libre Baskerville"/>
-          <w:i/>
-        </w:rPr>
-      </w:pPr>
-    </w:p>
-    <w:p>
-      <w:pPr>
-        <w:jc w:val="center"/>
-        <w:rPr>
-          <w:rFonts w:ascii="Libre Baskerville" w:hAnsi="Libre Baskerville"/>
-          <w:i/>
-        </w:rPr>
-      </w:pPr>
-      <w:proofErr w:type="spellStart"/>
-      <w:r>
-        <w:rPr>
-          <w:rFonts w:ascii="Libre Baskerville" w:hAnsi="Libre Baskerville"/>
-          <w:i/>
-        </w:rPr>
-        <w:t>Ensi</w:t>
-      </w:r>
-      <w:proofErr w:type="spellEnd"/>
-      <w:r>
-        <w:rPr>
-          <w:rFonts w:ascii="Libre Baskerville" w:hAnsi="Libre Baskerville"/>
-          <w:i/>
+      <w:r>
+        <w:rPr>
+          <w:rFonts w:ascii="Libre Baskerville" w:hAnsi="Libre Baskerville"/>
+          <w:i/>
+        </w:rPr>
+        <w:t>Embaga Ku Rina Island</w:t>
+      </w:r>
+    </w:p>
+    <w:p>
+      <w:pPr>
+        <w:jc w:val="center"/>
+        <w:rPr>
+          <w:rFonts w:ascii="Libre Baskerville" w:hAnsi="Libre Baskerville"/>
+          <w:i/>
+        </w:rPr>
+      </w:pPr>
+    </w:p>
+    <w:p>
+      <w:pPr>
+        <w:jc w:val="center"/>
+        <w:rPr>
+          <w:rFonts w:ascii="Libre Baskerville" w:hAnsi="Libre Baskerville"/>
+          <w:i/>
+        </w:rPr>
+      </w:pPr>
+      <w:r>
+        <w:rPr>
+          <w:rFonts w:ascii="Libre Baskerville" w:hAnsi="Libre Baskerville"/>
+          <w:i/>
+        </w:rPr>
+        <w:t>Ensi N’Amaguru</w:t>
+      </w:r>
+    </w:p>
+    <w:p>
+      <w:pPr>
+        <w:jc w:val="center"/>
+        <w:rPr>
+          <w:rFonts w:ascii="Libre Baskerville" w:hAnsi="Libre Baskerville"/>
+          <w:i/>
+        </w:rPr>
+      </w:pPr>
+    </w:p>
+    <w:p>
+      <w:pPr>
+        <w:jc w:val="center"/>
+        <w:rPr>
+          <w:rFonts w:ascii="Libre Baskerville" w:hAnsi="Libre Baskerville"/>
+          <w:i/>
+        </w:rPr>
+      </w:pPr>
+      <w:r>
+        <w:rPr>
+          <w:rFonts w:ascii="Libre Baskerville" w:hAnsi="Libre Baskerville"/>
+          <w:i/>
+        </w:rPr>
+        <w:t>Rock ‘N’ Draw</w:t>
+      </w:r>
+    </w:p>
+    <w:p>
+      <w:pPr>
+        <w:jc w:val="center"/>
+        <w:rPr>
+          <w:rFonts w:ascii="Libre Baskerville" w:hAnsi="Libre Baskerville"/>
+          <w:i/>
+        </w:rPr>
+      </w:pPr>
+    </w:p>
+    <w:p>
+      <w:pPr>
+        <w:jc w:val="center"/>
+        <w:rPr>
+          <w:rFonts w:ascii="Libre Baskerville" w:hAnsi="Libre Baskerville"/>
+          <w:i/>
+        </w:rPr>
+      </w:pPr>
+    </w:p>
+    <w:p>
+      <w:pPr>
+        <w:jc w:val="center"/>
+        <w:rPr>
+          <w:rFonts w:ascii="Libre Baskerville" w:hAnsi="Libre Baskerville"/>
+          <w:i/>
+        </w:rPr>
+      </w:pPr>
+      <w:r>
+        <w:rPr>
+          <w:rFonts w:ascii="Bookman Old Style" w:hAnsi="Bookman Old Style"/>
+        </w:rPr>
+        <w:t xml:space="preserve">- </w:t>
+      </w:r>
+      <w:r>
+        <w:rPr>
+          <w:rFonts w:ascii="Bookman Old Style" w:hAnsi="Bookman Old Style"/>
+          <w:b/>
+        </w:rPr>
+        <w:t>ACADEMIA</w:t>
+      </w:r>
+      <w:r>
+        <w:rPr>
+          <w:rFonts w:ascii="Bookman Old Style" w:hAnsi="Bookman Old Style"/>
         </w:rPr>
         <w:t xml:space="preserve"> </w:t>
       </w:r>
-      <w:proofErr w:type="spellStart"/>
-      <w:r>
-        <w:rPr>
-          <w:rFonts w:ascii="Libre Baskerville" w:hAnsi="Libre Baskerville"/>
-          <w:i/>
-        </w:rPr>
-        <w:t>N’Amaguru</w:t>
-      </w:r>
-      <w:proofErr w:type="spellEnd"/>
-    </w:p>
-    <w:p>
-      <w:pPr>
-        <w:jc w:val="center"/>
-        <w:rPr>
-          <w:rFonts w:ascii="Libre Baskerville" w:hAnsi="Libre Baskerville"/>
-          <w:i/>
-        </w:rPr>
-      </w:pPr>
-    </w:p>
-    <w:p>
-      <w:pPr>
-        <w:jc w:val="center"/>
-        <w:rPr>
-          <w:rFonts w:ascii="Libre Baskerville" w:hAnsi="Libre Baskerville"/>
-          <w:i/>
-        </w:rPr>
-      </w:pPr>
-      <w:r>
-        <w:rPr>
-          <w:rFonts w:ascii="Libre Baskerville" w:hAnsi="Libre Baskerville"/>
-          <w:i/>
-        </w:rPr>
-        <w:t>Rock ‘N’ Draw</w:t>
-      </w:r>
-    </w:p>
-    <w:p>
-      <w:pPr>
-        <w:jc w:val="center"/>
-        <w:rPr>
-          <w:rFonts w:ascii="Libre Baskerville" w:hAnsi="Libre Baskerville"/>
-          <w:i/>
-        </w:rPr>
-      </w:pPr>
-    </w:p>
-    <w:p>
-      <w:pPr>
-        <w:jc w:val="center"/>
-        <w:rPr>
-          <w:rFonts w:ascii="Libre Baskerville" w:hAnsi="Libre Baskerville"/>
-          <w:i/>
-        </w:rPr>
-      </w:pPr>
-    </w:p>
-    <w:p>
-      <w:pPr>
-        <w:jc w:val="center"/>
-        <w:rPr>
-          <w:rFonts w:ascii="Libre Baskerville" w:hAnsi="Libre Baskerville"/>
-          <w:i/>
-        </w:rPr>
-      </w:pPr>
       <w:r>
         <w:rPr>
           <w:rFonts w:ascii="Bookman Old Style" w:hAnsi="Bookman Old Style"/>
         </w:rPr>
-        <w:t xml:space="preserve">- </w:t>
-      </w:r>
-      <w:r>
+        <w:t>–</w:t>
+      </w:r>
+    </w:p>
+    <w:p>
+      <w:pPr>
+        <w:jc w:val="center"/>
         <w:rPr>
           <w:rFonts w:ascii="Bookman Old Style" w:hAnsi="Bookman Old Style"/>
-          <w:b/>
-        </w:rPr>
-        <w:t>ACADEMIA</w:t>
-      </w:r>
-      <w:r>
-        <w:rPr>
-          <w:rFonts w:ascii="Bookman Old Style" w:hAnsi="Bookman Old Style"/>
-        </w:rPr>
-        <w:t xml:space="preserve"> </w:t>
-      </w:r>
-      <w:r>
-        <w:rPr>
-          <w:rFonts w:ascii="Bookman Old Style" w:hAnsi="Bookman Old Style"/>
-        </w:rPr>
-        <w:t>–</w:t>
-      </w:r>
-    </w:p>
-    <w:p>
-      <w:pPr>
-        <w:jc w:val="center"/>
-        <w:rPr>
-          <w:rFonts w:ascii="Bookman Old Style" w:hAnsi="Bookman Old Style"/>
         </w:rPr>
       </w:pPr>
     </w:p>
@@ -597,72 +566,13 @@
           <w:rFonts w:ascii="Libre Baskerville" w:hAnsi="Libre Baskerville"/>
           <w:i/>
         </w:rPr>
-        <w:t xml:space="preserve">Novus </w:t>
-      </w:r>
-      <w:proofErr w:type="spellStart"/>
-      <w:r>
-        <w:rPr>
-          <w:rFonts w:ascii="Libre Baskerville" w:hAnsi="Libre Baskerville"/>
-          <w:i/>
-        </w:rPr>
-        <w:t>Modernus</w:t>
-      </w:r>
-      <w:proofErr w:type="spellEnd"/>
-      <w:r>
-        <w:rPr>
-          <w:rFonts w:ascii="Libre Baskerville" w:hAnsi="Libre Baskerville"/>
-          <w:i/>
-        </w:rPr>
-        <w:t xml:space="preserve"> </w:t>
-      </w:r>
-      <w:proofErr w:type="spellStart"/>
-      <w:r>
-        <w:rPr>
-          <w:rFonts w:ascii="Libre Baskerville" w:hAnsi="Libre Baskerville"/>
-          <w:i/>
-        </w:rPr>
-        <w:t>Grimoire</w:t>
-      </w:r>
-      <w:proofErr w:type="spellEnd"/>
-      <w:r>
-        <w:rPr>
-          <w:rFonts w:ascii="Libre Baskerville" w:hAnsi="Libre Baskerville"/>
-          <w:i/>
-        </w:rPr>
-        <w:t xml:space="preserve"> </w:t>
-      </w:r>
-      <w:proofErr w:type="spellStart"/>
-      <w:r>
-        <w:rPr>
-          <w:rFonts w:ascii="Libre Baskerville" w:hAnsi="Libre Baskerville"/>
-          <w:i/>
-        </w:rPr>
-        <w:t>Lumtauto</w:t>
-      </w:r>
-      <w:proofErr w:type="spellEnd"/>
-      <w:r>
-        <w:rPr>
-          <w:rFonts w:ascii="Libre Baskerville" w:hAnsi="Libre Baskerville"/>
-          <w:i/>
-        </w:rPr>
-        <w:t xml:space="preserve"> </w:t>
-      </w:r>
-      <w:proofErr w:type="spellStart"/>
-      <w:r>
-        <w:rPr>
-          <w:rFonts w:ascii="Libre Baskerville" w:hAnsi="Libre Baskerville"/>
-          <w:i/>
-        </w:rPr>
-        <w:t>Magia</w:t>
-      </w:r>
-      <w:proofErr w:type="spellEnd"/>
+        <w:t>Novus Modernus Grimoire Lumtauto Magia</w:t>
+      </w:r>
     </w:p>
     <w:p>
       <w:r>
         <w:br w:type="page"/>
       </w:r>
-      <w:bookmarkStart w:id="0" w:name="_GoBack"/>
-      <w:bookmarkEnd w:id="0"/>
     </w:p>
     <w:p>
       <w:pPr>
@@ -740,19 +650,7 @@
           <w:rFonts w:ascii="Libre Baskerville" w:hAnsi="Libre Baskerville"/>
           <w:i/>
         </w:rPr>
-        <w:t>mini-treatise</w:t>
-      </w:r>
-      <w:r>
-        <w:rPr>
-          <w:rFonts w:ascii="Libre Baskerville" w:hAnsi="Libre Baskerville"/>
-        </w:rPr>
-        <w:t xml:space="preserve"> </w:t>
-      </w:r>
-      <w:r>
-        <w:rPr>
-          <w:rFonts w:ascii="Libre Baskerville" w:hAnsi="Libre Baskerville"/>
-        </w:rPr>
-        <w:t>monograph</w:t>
+        <w:t>treatise</w:t>
       </w:r>
     </w:p>
     <w:p>
@@ -1052,7 +950,13 @@
         <w:rPr>
           <w:rFonts w:ascii="Libre Baskerville" w:hAnsi="Libre Baskerville"/>
         </w:rPr>
-        <w:t>Copyright © Joseph Willrich Lutalo 2025</w:t>
+        <w:t>Copyrig</w:t>
+      </w:r>
+      <w:r>
+        <w:rPr>
+          <w:rFonts w:ascii="Libre Baskerville" w:hAnsi="Libre Baskerville"/>
+        </w:rPr>
+        <w:t>ht © Joseph Willrich Lutalo 2026</w:t>
       </w:r>
     </w:p>
     <w:p>
@@ -1110,21 +1014,7 @@
         <w:rPr>
           <w:rFonts w:ascii="Libre Baskerville" w:hAnsi="Libre Baskerville"/>
         </w:rPr>
-        <w:t xml:space="preserve">The right of Joseph Willrich Lutalo to </w:t>
-      </w:r>
-      <w:proofErr w:type="gramStart"/>
-      <w:r>
-        <w:rPr>
-          <w:rFonts w:ascii="Libre Baskerville" w:hAnsi="Libre Baskerville"/>
-        </w:rPr>
-        <w:t>be identified</w:t>
-      </w:r>
-      <w:proofErr w:type="gramEnd"/>
-      <w:r>
-        <w:rPr>
-          <w:rFonts w:ascii="Libre Baskerville" w:hAnsi="Libre Baskerville"/>
-        </w:rPr>
-        <w:t xml:space="preserve"> as the author of this work has been asserted by him in accordance with the Copyright, Designs and Patents Act 1988.</w:t>
+        <w:t>The right of Joseph Willrich Lutalo to be identified as the author of this work has been asserted by him in accordance with the Copyright, Designs and Patents Act 1988.</w:t>
       </w:r>
     </w:p>
     <w:p>
@@ -1217,7 +1107,6 @@
           <w:b/>
         </w:rPr>
       </w:pPr>
-      <w:proofErr w:type="gramStart"/>
       <w:r>
         <w:rPr>
           <w:rFonts w:ascii="Libre Baskerville" w:hAnsi="Libre Baskerville"/>
@@ -1229,15 +1118,7 @@
           <w:rFonts w:ascii="Libre Baskerville" w:hAnsi="Libre Baskerville"/>
           <w:b/>
         </w:rPr>
-        <w:t>:</w:t>
-      </w:r>
-      <w:proofErr w:type="gramEnd"/>
-      <w:r>
-        <w:rPr>
-          <w:rFonts w:ascii="Libre Baskerville" w:hAnsi="Libre Baskerville"/>
-          <w:b/>
-        </w:rPr>
-        <w:t xml:space="preserve"> </w:t>
+        <w:t xml:space="preserve">: </w:t>
       </w:r>
     </w:p>
     <w:p>
@@ -1410,6 +1291,10 @@
       <w:pPr>
         <w:ind w:left="360"/>
         <w:jc w:val="center"/>
+        <w:rPr>
+          <w:rFonts w:ascii="Libre Baskerville" w:hAnsi="Libre Baskerville"/>
+          <w:b/>
+        </w:rPr>
       </w:pPr>
       <w:r>
         <w:rPr>
@@ -1500,6 +1385,102 @@
         </w:rPr>
         <w:t>, 2025</w:t>
       </w:r>
+    </w:p>
+    <w:p>
+      <w:pPr>
+        <w:ind w:left="360"/>
+        <w:jc w:val="center"/>
+      </w:pPr>
+      <w:r>
+        <w:rPr>
+          <w:rFonts w:ascii="Libre Baskerville" w:hAnsi="Libre Baskerville"/>
+          <w:b/>
+        </w:rPr>
+        <w:t xml:space="preserve">I*POW </w:t>
+      </w:r>
+      <w:r>
+        <w:rPr>
+          <w:rFonts w:ascii="Libre Baskerville" w:hAnsi="Libre Baskerville"/>
+          <w:b/>
+          <w:color w:val="FF0000"/>
+        </w:rPr>
+        <w:t>2</w:t>
+      </w:r>
+      <w:r>
+        <w:rPr>
+          <w:rFonts w:ascii="Libre Baskerville" w:hAnsi="Libre Baskerville"/>
+          <w:b/>
+          <w:color w:val="FF0000"/>
+          <w:vertAlign w:val="superscript"/>
+        </w:rPr>
+        <w:t>nd</w:t>
+      </w:r>
+      <w:r>
+        <w:rPr>
+          <w:rFonts w:ascii="Libre Baskerville" w:hAnsi="Libre Baskerville"/>
+          <w:b/>
+          <w:color w:val="FF0000"/>
+        </w:rPr>
+        <w:t xml:space="preserve"> </w:t>
+      </w:r>
+      <w:r>
+        <w:rPr>
+          <w:rFonts w:ascii="Libre Baskerville" w:hAnsi="Libre Baskerville"/>
+          <w:b/>
+          <w:color w:val="FF0000"/>
+        </w:rPr>
+        <w:t>Edition-DRAFT</w:t>
+      </w:r>
+      <w:bookmarkStart w:id="0" w:name="_GoBack"/>
+      <w:bookmarkEnd w:id="0"/>
+      <w:r>
+        <w:rPr>
+          <w:rFonts w:ascii="Libre Baskerville" w:hAnsi="Libre Baskerville"/>
+          <w:color w:val="FF0000"/>
+        </w:rPr>
+        <w:t xml:space="preserve"> </w:t>
+      </w:r>
+      <w:r>
+        <w:rPr>
+          <w:rFonts w:ascii="Libre Baskerville" w:hAnsi="Libre Baskerville"/>
+        </w:rPr>
+        <w:t xml:space="preserve">on </w:t>
+      </w:r>
+      <w:r>
+        <w:rPr>
+          <w:rFonts w:ascii="Libre Baskerville" w:hAnsi="Libre Baskerville"/>
+          <w:b/>
+        </w:rPr>
+        <w:t>22</w:t>
+      </w:r>
+      <w:r>
+        <w:rPr>
+          <w:rFonts w:ascii="Libre Baskerville" w:hAnsi="Libre Baskerville"/>
+          <w:b/>
+          <w:vertAlign w:val="superscript"/>
+        </w:rPr>
+        <w:t>nd</w:t>
+      </w:r>
+      <w:r>
+        <w:rPr>
+          <w:rFonts w:ascii="Libre Baskerville" w:hAnsi="Libre Baskerville"/>
+          <w:b/>
+        </w:rPr>
+        <w:t xml:space="preserve"> </w:t>
+      </w:r>
+      <w:r>
+        <w:rPr>
+          <w:rFonts w:ascii="Libre Baskerville" w:hAnsi="Libre Baskerville"/>
+          <w:b/>
+        </w:rPr>
+        <w:t>January, 2026</w:t>
+      </w:r>
+    </w:p>
+    <w:p>
+      <w:pPr>
+        <w:ind w:left="360"/>
+        <w:jc w:val="center"/>
+      </w:pPr>
     </w:p>
     <w:p>
       <w:pPr>

</xml_diff>

<commit_message>
finished preparing IPOW draft of 2ND EDITION
</commit_message>
<xml_diff>
--- a/resources/pdfs/FrontisMatter.docx
+++ b/resources/pdfs/FrontisMatter.docx
@@ -145,7 +145,21 @@
         <w:rPr>
           <w:rFonts w:ascii="Libre Baskerville" w:hAnsi="Libre Baskerville"/>
         </w:rPr>
-        <w:t xml:space="preserve">treatise on the mathematics, philosophy and practice of Transformatics for </w:t>
+        <w:t xml:space="preserve">treatise on the mathematics, philosophy and practice of </w:t>
+      </w:r>
+      <w:proofErr w:type="spellStart"/>
+      <w:r>
+        <w:rPr>
+          <w:rFonts w:ascii="Libre Baskerville" w:hAnsi="Libre Baskerville"/>
+        </w:rPr>
+        <w:t>Transformatics</w:t>
+      </w:r>
+      <w:proofErr w:type="spellEnd"/>
+      <w:r>
+        <w:rPr>
+          <w:rFonts w:ascii="Libre Baskerville" w:hAnsi="Libre Baskerville"/>
+        </w:rPr>
+        <w:t xml:space="preserve"> for </w:t>
       </w:r>
       <w:r>
         <w:rPr>
@@ -319,38 +333,81 @@
           <w:i/>
         </w:rPr>
       </w:pPr>
-      <w:r>
-        <w:rPr>
-          <w:rFonts w:ascii="Libre Baskerville" w:hAnsi="Libre Baskerville"/>
-          <w:i/>
-        </w:rPr>
-        <w:t>Embaga Ku Rina Island</w:t>
-      </w:r>
-    </w:p>
-    <w:p>
-      <w:pPr>
-        <w:jc w:val="center"/>
-        <w:rPr>
-          <w:rFonts w:ascii="Libre Baskerville" w:hAnsi="Libre Baskerville"/>
-          <w:i/>
-        </w:rPr>
-      </w:pPr>
-    </w:p>
-    <w:p>
-      <w:pPr>
-        <w:jc w:val="center"/>
-        <w:rPr>
-          <w:rFonts w:ascii="Libre Baskerville" w:hAnsi="Libre Baskerville"/>
-          <w:i/>
-        </w:rPr>
-      </w:pPr>
-      <w:r>
-        <w:rPr>
-          <w:rFonts w:ascii="Libre Baskerville" w:hAnsi="Libre Baskerville"/>
-          <w:i/>
-        </w:rPr>
-        <w:t>Ensi N’Amaguru</w:t>
-      </w:r>
+      <w:proofErr w:type="spellStart"/>
+      <w:r>
+        <w:rPr>
+          <w:rFonts w:ascii="Libre Baskerville" w:hAnsi="Libre Baskerville"/>
+          <w:i/>
+        </w:rPr>
+        <w:t>Embaga</w:t>
+      </w:r>
+      <w:proofErr w:type="spellEnd"/>
+      <w:r>
+        <w:rPr>
+          <w:rFonts w:ascii="Libre Baskerville" w:hAnsi="Libre Baskerville"/>
+          <w:i/>
+        </w:rPr>
+        <w:t xml:space="preserve"> Ku </w:t>
+      </w:r>
+      <w:proofErr w:type="spellStart"/>
+      <w:r>
+        <w:rPr>
+          <w:rFonts w:ascii="Libre Baskerville" w:hAnsi="Libre Baskerville"/>
+          <w:i/>
+        </w:rPr>
+        <w:t>Rina</w:t>
+      </w:r>
+      <w:proofErr w:type="spellEnd"/>
+      <w:r>
+        <w:rPr>
+          <w:rFonts w:ascii="Libre Baskerville" w:hAnsi="Libre Baskerville"/>
+          <w:i/>
+        </w:rPr>
+        <w:t xml:space="preserve"> Island</w:t>
+      </w:r>
+    </w:p>
+    <w:p>
+      <w:pPr>
+        <w:jc w:val="center"/>
+        <w:rPr>
+          <w:rFonts w:ascii="Libre Baskerville" w:hAnsi="Libre Baskerville"/>
+          <w:i/>
+        </w:rPr>
+      </w:pPr>
+    </w:p>
+    <w:p>
+      <w:pPr>
+        <w:jc w:val="center"/>
+        <w:rPr>
+          <w:rFonts w:ascii="Libre Baskerville" w:hAnsi="Libre Baskerville"/>
+          <w:i/>
+        </w:rPr>
+      </w:pPr>
+      <w:proofErr w:type="spellStart"/>
+      <w:r>
+        <w:rPr>
+          <w:rFonts w:ascii="Libre Baskerville" w:hAnsi="Libre Baskerville"/>
+          <w:i/>
+        </w:rPr>
+        <w:t>Ensi</w:t>
+      </w:r>
+      <w:proofErr w:type="spellEnd"/>
+      <w:r>
+        <w:rPr>
+          <w:rFonts w:ascii="Libre Baskerville" w:hAnsi="Libre Baskerville"/>
+          <w:i/>
+        </w:rPr>
+        <w:t xml:space="preserve"> </w:t>
+      </w:r>
+      <w:proofErr w:type="spellStart"/>
+      <w:r>
+        <w:rPr>
+          <w:rFonts w:ascii="Libre Baskerville" w:hAnsi="Libre Baskerville"/>
+          <w:i/>
+        </w:rPr>
+        <w:t>N’Amaguru</w:t>
+      </w:r>
+      <w:proofErr w:type="spellEnd"/>
     </w:p>
     <w:p>
       <w:pPr>
@@ -566,8 +623,65 @@
           <w:rFonts w:ascii="Libre Baskerville" w:hAnsi="Libre Baskerville"/>
           <w:i/>
         </w:rPr>
-        <w:t>Novus Modernus Grimoire Lumtauto Magia</w:t>
-      </w:r>
+        <w:t xml:space="preserve">Novus </w:t>
+      </w:r>
+      <w:proofErr w:type="spellStart"/>
+      <w:r>
+        <w:rPr>
+          <w:rFonts w:ascii="Libre Baskerville" w:hAnsi="Libre Baskerville"/>
+          <w:i/>
+        </w:rPr>
+        <w:t>Modernus</w:t>
+      </w:r>
+      <w:proofErr w:type="spellEnd"/>
+      <w:r>
+        <w:rPr>
+          <w:rFonts w:ascii="Libre Baskerville" w:hAnsi="Libre Baskerville"/>
+          <w:i/>
+        </w:rPr>
+        <w:t xml:space="preserve"> </w:t>
+      </w:r>
+      <w:proofErr w:type="spellStart"/>
+      <w:r>
+        <w:rPr>
+          <w:rFonts w:ascii="Libre Baskerville" w:hAnsi="Libre Baskerville"/>
+          <w:i/>
+        </w:rPr>
+        <w:t>Grimoire</w:t>
+      </w:r>
+      <w:proofErr w:type="spellEnd"/>
+      <w:r>
+        <w:rPr>
+          <w:rFonts w:ascii="Libre Baskerville" w:hAnsi="Libre Baskerville"/>
+          <w:i/>
+        </w:rPr>
+        <w:t xml:space="preserve"> </w:t>
+      </w:r>
+      <w:proofErr w:type="spellStart"/>
+      <w:r>
+        <w:rPr>
+          <w:rFonts w:ascii="Libre Baskerville" w:hAnsi="Libre Baskerville"/>
+          <w:i/>
+        </w:rPr>
+        <w:t>Lumtauto</w:t>
+      </w:r>
+      <w:proofErr w:type="spellEnd"/>
+      <w:r>
+        <w:rPr>
+          <w:rFonts w:ascii="Libre Baskerville" w:hAnsi="Libre Baskerville"/>
+          <w:i/>
+        </w:rPr>
+        <w:t xml:space="preserve"> </w:t>
+      </w:r>
+      <w:proofErr w:type="spellStart"/>
+      <w:r>
+        <w:rPr>
+          <w:rFonts w:ascii="Libre Baskerville" w:hAnsi="Libre Baskerville"/>
+          <w:i/>
+        </w:rPr>
+        <w:t>Magia</w:t>
+      </w:r>
+      <w:proofErr w:type="spellEnd"/>
     </w:p>
     <w:p>
       <w:r>
@@ -1014,7 +1128,21 @@
         <w:rPr>
           <w:rFonts w:ascii="Libre Baskerville" w:hAnsi="Libre Baskerville"/>
         </w:rPr>
-        <w:t>The right of Joseph Willrich Lutalo to be identified as the author of this work has been asserted by him in accordance with the Copyright, Designs and Patents Act 1988.</w:t>
+        <w:t xml:space="preserve">The right of Joseph Willrich Lutalo to </w:t>
+      </w:r>
+      <w:proofErr w:type="gramStart"/>
+      <w:r>
+        <w:rPr>
+          <w:rFonts w:ascii="Libre Baskerville" w:hAnsi="Libre Baskerville"/>
+        </w:rPr>
+        <w:t>be identified</w:t>
+      </w:r>
+      <w:proofErr w:type="gramEnd"/>
+      <w:r>
+        <w:rPr>
+          <w:rFonts w:ascii="Libre Baskerville" w:hAnsi="Libre Baskerville"/>
+        </w:rPr>
+        <w:t xml:space="preserve"> as the author of this work has been asserted by him in accordance with the Copyright, Designs and Patents Act 1988.</w:t>
       </w:r>
     </w:p>
     <w:p>
@@ -1107,6 +1235,7 @@
           <w:b/>
         </w:rPr>
       </w:pPr>
+      <w:proofErr w:type="gramStart"/>
       <w:r>
         <w:rPr>
           <w:rFonts w:ascii="Libre Baskerville" w:hAnsi="Libre Baskerville"/>
@@ -1118,7 +1247,15 @@
           <w:rFonts w:ascii="Libre Baskerville" w:hAnsi="Libre Baskerville"/>
           <w:b/>
         </w:rPr>
-        <w:t xml:space="preserve">: </w:t>
+        <w:t>:</w:t>
+      </w:r>
+      <w:proofErr w:type="gramEnd"/>
+      <w:r>
+        <w:rPr>
+          <w:rFonts w:ascii="Libre Baskerville" w:hAnsi="Libre Baskerville"/>
+          <w:b/>
+        </w:rPr>
+        <w:t xml:space="preserve"> </w:t>
       </w:r>
     </w:p>
     <w:p>
@@ -1431,49 +1568,63 @@
         </w:rPr>
         <w:t>Edition-DRAFT</w:t>
       </w:r>
+      <w:r>
+        <w:rPr>
+          <w:rFonts w:ascii="Libre Baskerville" w:hAnsi="Libre Baskerville"/>
+          <w:color w:val="FF0000"/>
+        </w:rPr>
+        <w:t xml:space="preserve"> </w:t>
+      </w:r>
+      <w:r>
+        <w:rPr>
+          <w:rFonts w:ascii="Libre Baskerville" w:hAnsi="Libre Baskerville"/>
+        </w:rPr>
+        <w:t xml:space="preserve">on </w:t>
+      </w:r>
+      <w:r>
+        <w:rPr>
+          <w:rFonts w:ascii="Libre Baskerville" w:hAnsi="Libre Baskerville"/>
+          <w:b/>
+        </w:rPr>
+        <w:t>2</w:t>
+      </w:r>
+      <w:r>
+        <w:rPr>
+          <w:rFonts w:ascii="Libre Baskerville" w:hAnsi="Libre Baskerville"/>
+          <w:b/>
+        </w:rPr>
+        <w:t>8</w:t>
+      </w:r>
+      <w:r>
+        <w:rPr>
+          <w:rFonts w:ascii="Libre Baskerville" w:hAnsi="Libre Baskerville"/>
+          <w:b/>
+          <w:vertAlign w:val="superscript"/>
+        </w:rPr>
+        <w:t>th</w:t>
+      </w:r>
+      <w:r>
+        <w:rPr>
+          <w:rFonts w:ascii="Libre Baskerville" w:hAnsi="Libre Baskerville"/>
+          <w:b/>
+        </w:rPr>
+        <w:t xml:space="preserve"> </w:t>
+      </w:r>
+      <w:r>
+        <w:rPr>
+          <w:rFonts w:ascii="Libre Baskerville" w:hAnsi="Libre Baskerville"/>
+          <w:b/>
+        </w:rPr>
+        <w:t>February</w:t>
+      </w:r>
       <w:bookmarkStart w:id="0" w:name="_GoBack"/>
       <w:bookmarkEnd w:id="0"/>
       <w:r>
         <w:rPr>
           <w:rFonts w:ascii="Libre Baskerville" w:hAnsi="Libre Baskerville"/>
-          <w:color w:val="FF0000"/>
-        </w:rPr>
-        <w:t xml:space="preserve"> </w:t>
-      </w:r>
-      <w:r>
-        <w:rPr>
-          <w:rFonts w:ascii="Libre Baskerville" w:hAnsi="Libre Baskerville"/>
-        </w:rPr>
-        <w:t xml:space="preserve">on </w:t>
-      </w:r>
-      <w:r>
-        <w:rPr>
-          <w:rFonts w:ascii="Libre Baskerville" w:hAnsi="Libre Baskerville"/>
-          <w:b/>
-        </w:rPr>
-        <w:t>22</w:t>
-      </w:r>
-      <w:r>
-        <w:rPr>
-          <w:rFonts w:ascii="Libre Baskerville" w:hAnsi="Libre Baskerville"/>
-          <w:b/>
-          <w:vertAlign w:val="superscript"/>
-        </w:rPr>
-        <w:t>nd</w:t>
-      </w:r>
-      <w:r>
-        <w:rPr>
-          <w:rFonts w:ascii="Libre Baskerville" w:hAnsi="Libre Baskerville"/>
-          <w:b/>
-        </w:rPr>
-        <w:t xml:space="preserve"> </w:t>
-      </w:r>
-      <w:r>
-        <w:rPr>
-          <w:rFonts w:ascii="Libre Baskerville" w:hAnsi="Libre Baskerville"/>
-          <w:b/>
-        </w:rPr>
-        <w:t>January, 2026</w:t>
+          <w:b/>
+        </w:rPr>
+        <w:t>, 2026</w:t>
       </w:r>
     </w:p>
     <w:p>

</xml_diff>